<commit_message>
Warm golden redesign and 5 real products
</commit_message>
<xml_diff>
--- a/Documentation/Making Updates to the Final Version.docx
+++ b/Documentation/Making Updates to the Final Version.docx
@@ -1033,21 +1033,448 @@
     </w:p>
     <w:p>
       <w:pPr>
-        <w:spacing w:after="0" w:line="240" w:lineRule="auto"/>
-        <w:rPr>
-          <w:rFonts w:ascii="Times New Roman" w:eastAsia="Times New Roman" w:hAnsi="Times New Roman" w:cs="Times New Roman"/>
-          <w:kern w:val="0"/>
-          <w14:ligatures w14:val="none"/>
-        </w:rPr>
-      </w:pPr>
-      <w:r>
-        <w:rPr>
-          <w:rFonts w:ascii="Times New Roman" w:eastAsia="Times New Roman" w:hAnsi="Times New Roman" w:cs="Times New Roman"/>
-          <w:kern w:val="0"/>
-          <w14:ligatures w14:val="none"/>
-        </w:rPr>
-        <w:t>Opus 4.7</w:t>
-      </w:r>
+        <w:spacing w:before="100" w:beforeAutospacing="1" w:after="100" w:afterAutospacing="1" w:line="240" w:lineRule="auto"/>
+        <w:rPr>
+          <w:rFonts w:ascii="Times New Roman" w:eastAsia="Times New Roman" w:hAnsi="Times New Roman" w:cs="Times New Roman"/>
+          <w:kern w:val="0"/>
+          <w14:ligatures w14:val="none"/>
+        </w:rPr>
+      </w:pPr>
+    </w:p>
+    <w:p>
+      <w:pPr>
+        <w:rPr>
+          <w:rFonts w:ascii="Times New Roman" w:eastAsia="Times New Roman" w:hAnsi="Times New Roman" w:cs="Times New Roman"/>
+          <w:kern w:val="0"/>
+          <w14:ligatures w14:val="none"/>
+        </w:rPr>
+      </w:pPr>
+      <w:r>
+        <w:rPr>
+          <w:rFonts w:ascii="Times New Roman" w:eastAsia="Times New Roman" w:hAnsi="Times New Roman" w:cs="Times New Roman"/>
+          <w:b/>
+          <w:bCs/>
+          <w:kern w:val="0"/>
+          <w:u w:val="single"/>
+          <w14:ligatures w14:val="none"/>
+        </w:rPr>
+        <w:lastRenderedPageBreak/>
+        <w:t xml:space="preserve">Commit to </w:t>
+      </w:r>
+      <w:proofErr w:type="spellStart"/>
+      <w:r>
+        <w:rPr>
+          <w:rFonts w:ascii="Times New Roman" w:eastAsia="Times New Roman" w:hAnsi="Times New Roman" w:cs="Times New Roman"/>
+          <w:b/>
+          <w:bCs/>
+          <w:kern w:val="0"/>
+          <w:u w:val="single"/>
+          <w14:ligatures w14:val="none"/>
+        </w:rPr>
+        <w:t>Github</w:t>
+      </w:r>
+      <w:proofErr w:type="spellEnd"/>
+    </w:p>
+    <w:p>
+      <w:pPr>
+        <w:rPr>
+          <w:rFonts w:ascii="Times New Roman" w:eastAsia="Times New Roman" w:hAnsi="Times New Roman" w:cs="Times New Roman"/>
+          <w:kern w:val="0"/>
+          <w14:ligatures w14:val="none"/>
+        </w:rPr>
+      </w:pPr>
+    </w:p>
+    <w:p>
+      <w:pPr>
+        <w:rPr>
+          <w:rFonts w:ascii="Times New Roman" w:eastAsia="Times New Roman" w:hAnsi="Times New Roman" w:cs="Times New Roman"/>
+          <w:kern w:val="0"/>
+          <w14:ligatures w14:val="none"/>
+        </w:rPr>
+      </w:pPr>
+      <w:r>
+        <w:rPr>
+          <w:rFonts w:ascii="Times New Roman" w:eastAsia="Times New Roman" w:hAnsi="Times New Roman" w:cs="Times New Roman"/>
+          <w:kern w:val="0"/>
+          <w14:ligatures w14:val="none"/>
+        </w:rPr>
+        <w:t>From your terminal (Git Bash or Command Prompt), inside the repo folder:</w:t>
+      </w:r>
+    </w:p>
+    <w:p>
+      <w:pPr>
+        <w:rPr>
+          <w:rFonts w:ascii="Times New Roman" w:eastAsia="Times New Roman" w:hAnsi="Times New Roman" w:cs="Times New Roman"/>
+          <w:kern w:val="0"/>
+          <w14:ligatures w14:val="none"/>
+        </w:rPr>
+      </w:pPr>
+      <w:r>
+        <w:rPr>
+          <w:rFonts w:ascii="Times New Roman" w:eastAsia="Times New Roman" w:hAnsi="Times New Roman" w:cs="Times New Roman"/>
+          <w:kern w:val="0"/>
+          <w14:ligatures w14:val="none"/>
+        </w:rPr>
+        <w:t>cd "C:\Users\Tim Thomasson\Interactive-Pet-Marketplace"</w:t>
+      </w:r>
+    </w:p>
+    <w:p>
+      <w:pPr>
+        <w:rPr>
+          <w:rFonts w:ascii="Times New Roman" w:eastAsia="Times New Roman" w:hAnsi="Times New Roman" w:cs="Times New Roman"/>
+          <w:kern w:val="0"/>
+          <w14:ligatures w14:val="none"/>
+        </w:rPr>
+      </w:pPr>
+      <w:r>
+        <w:rPr>
+          <w:rFonts w:ascii="Times New Roman" w:eastAsia="Times New Roman" w:hAnsi="Times New Roman" w:cs="Times New Roman"/>
+          <w:kern w:val="0"/>
+          <w14:ligatures w14:val="none"/>
+        </w:rPr>
+        <w:t>Then three commands, one at a time:</w:t>
+      </w:r>
+    </w:p>
+    <w:p>
+      <w:pPr>
+        <w:rPr>
+          <w:rFonts w:ascii="Times New Roman" w:eastAsia="Times New Roman" w:hAnsi="Times New Roman" w:cs="Times New Roman"/>
+          <w:kern w:val="0"/>
+          <w14:ligatures w14:val="none"/>
+        </w:rPr>
+      </w:pPr>
+      <w:r>
+        <w:rPr>
+          <w:rFonts w:ascii="Times New Roman" w:eastAsia="Times New Roman" w:hAnsi="Times New Roman" w:cs="Times New Roman"/>
+          <w:b/>
+          <w:bCs/>
+          <w:kern w:val="0"/>
+          <w14:ligatures w14:val="none"/>
+        </w:rPr>
+        <w:t>1. Stage all your changes:</w:t>
+      </w:r>
+    </w:p>
+    <w:p>
+      <w:pPr>
+        <w:rPr>
+          <w:rFonts w:ascii="Times New Roman" w:eastAsia="Times New Roman" w:hAnsi="Times New Roman" w:cs="Times New Roman"/>
+          <w:kern w:val="0"/>
+          <w14:ligatures w14:val="none"/>
+        </w:rPr>
+      </w:pPr>
+      <w:r>
+        <w:rPr>
+          <w:rFonts w:ascii="Times New Roman" w:eastAsia="Times New Roman" w:hAnsi="Times New Roman" w:cs="Times New Roman"/>
+          <w:kern w:val="0"/>
+          <w14:ligatures w14:val="none"/>
+        </w:rPr>
+        <w:t>git add -A</w:t>
+      </w:r>
+    </w:p>
+    <w:p>
+      <w:pPr>
+        <w:rPr>
+          <w:rFonts w:ascii="Times New Roman" w:eastAsia="Times New Roman" w:hAnsi="Times New Roman" w:cs="Times New Roman"/>
+          <w:kern w:val="0"/>
+          <w14:ligatures w14:val="none"/>
+        </w:rPr>
+      </w:pPr>
+      <w:r>
+        <w:rPr>
+          <w:rFonts w:ascii="Times New Roman" w:eastAsia="Times New Roman" w:hAnsi="Times New Roman" w:cs="Times New Roman"/>
+          <w:kern w:val="0"/>
+          <w14:ligatures w14:val="none"/>
+        </w:rPr>
+        <w:t xml:space="preserve">This tells </w:t>
+      </w:r>
+      <w:proofErr w:type="gramStart"/>
+      <w:r>
+        <w:rPr>
+          <w:rFonts w:ascii="Times New Roman" w:eastAsia="Times New Roman" w:hAnsi="Times New Roman" w:cs="Times New Roman"/>
+          <w:kern w:val="0"/>
+          <w14:ligatures w14:val="none"/>
+        </w:rPr>
+        <w:t>Git</w:t>
+      </w:r>
+      <w:proofErr w:type="gramEnd"/>
+      <w:r>
+        <w:rPr>
+          <w:rFonts w:ascii="Times New Roman" w:eastAsia="Times New Roman" w:hAnsi="Times New Roman" w:cs="Times New Roman"/>
+          <w:kern w:val="0"/>
+          <w14:ligatures w14:val="none"/>
+        </w:rPr>
+        <w:t xml:space="preserve"> "include everything that's new, modified, or deleted." Silent if it works.</w:t>
+      </w:r>
+    </w:p>
+    <w:p>
+      <w:pPr>
+        <w:rPr>
+          <w:rFonts w:ascii="Times New Roman" w:eastAsia="Times New Roman" w:hAnsi="Times New Roman" w:cs="Times New Roman"/>
+          <w:kern w:val="0"/>
+          <w14:ligatures w14:val="none"/>
+        </w:rPr>
+      </w:pPr>
+      <w:r>
+        <w:rPr>
+          <w:rFonts w:ascii="Times New Roman" w:eastAsia="Times New Roman" w:hAnsi="Times New Roman" w:cs="Times New Roman"/>
+          <w:b/>
+          <w:bCs/>
+          <w:kern w:val="0"/>
+          <w14:ligatures w14:val="none"/>
+        </w:rPr>
+        <w:t xml:space="preserve">2. </w:t>
+      </w:r>
+      <w:proofErr w:type="gramStart"/>
+      <w:r>
+        <w:rPr>
+          <w:rFonts w:ascii="Times New Roman" w:eastAsia="Times New Roman" w:hAnsi="Times New Roman" w:cs="Times New Roman"/>
+          <w:b/>
+          <w:bCs/>
+          <w:kern w:val="0"/>
+          <w14:ligatures w14:val="none"/>
+        </w:rPr>
+        <w:t>Commit with</w:t>
+      </w:r>
+      <w:proofErr w:type="gramEnd"/>
+      <w:r>
+        <w:rPr>
+          <w:rFonts w:ascii="Times New Roman" w:eastAsia="Times New Roman" w:hAnsi="Times New Roman" w:cs="Times New Roman"/>
+          <w:b/>
+          <w:bCs/>
+          <w:kern w:val="0"/>
+          <w14:ligatures w14:val="none"/>
+        </w:rPr>
+        <w:t xml:space="preserve"> a message:</w:t>
+      </w:r>
+    </w:p>
+    <w:p>
+      <w:pPr>
+        <w:rPr>
+          <w:rFonts w:ascii="Times New Roman" w:eastAsia="Times New Roman" w:hAnsi="Times New Roman" w:cs="Times New Roman"/>
+          <w:kern w:val="0"/>
+          <w14:ligatures w14:val="none"/>
+        </w:rPr>
+      </w:pPr>
+      <w:r>
+        <w:rPr>
+          <w:rFonts w:ascii="Times New Roman" w:eastAsia="Times New Roman" w:hAnsi="Times New Roman" w:cs="Times New Roman"/>
+          <w:kern w:val="0"/>
+          <w14:ligatures w14:val="none"/>
+        </w:rPr>
+        <w:t>git commit -m "Warm golden redesign and 5 real products"</w:t>
+      </w:r>
+    </w:p>
+    <w:p>
+      <w:pPr>
+        <w:rPr>
+          <w:rFonts w:ascii="Times New Roman" w:eastAsia="Times New Roman" w:hAnsi="Times New Roman" w:cs="Times New Roman"/>
+          <w:kern w:val="0"/>
+          <w14:ligatures w14:val="none"/>
+        </w:rPr>
+      </w:pPr>
+      <w:r>
+        <w:rPr>
+          <w:rFonts w:ascii="Times New Roman" w:eastAsia="Times New Roman" w:hAnsi="Times New Roman" w:cs="Times New Roman"/>
+          <w:kern w:val="0"/>
+          <w14:ligatures w14:val="none"/>
+        </w:rPr>
+        <w:t>You'll see output listing the files and the commit hash.</w:t>
+      </w:r>
+    </w:p>
+    <w:p>
+      <w:pPr>
+        <w:rPr>
+          <w:rFonts w:ascii="Times New Roman" w:eastAsia="Times New Roman" w:hAnsi="Times New Roman" w:cs="Times New Roman"/>
+          <w:kern w:val="0"/>
+          <w14:ligatures w14:val="none"/>
+        </w:rPr>
+      </w:pPr>
+      <w:r>
+        <w:rPr>
+          <w:rFonts w:ascii="Times New Roman" w:eastAsia="Times New Roman" w:hAnsi="Times New Roman" w:cs="Times New Roman"/>
+          <w:b/>
+          <w:bCs/>
+          <w:kern w:val="0"/>
+          <w14:ligatures w14:val="none"/>
+        </w:rPr>
+        <w:t>3. Push to GitHub:</w:t>
+      </w:r>
+    </w:p>
+    <w:p>
+      <w:pPr>
+        <w:rPr>
+          <w:rFonts w:ascii="Times New Roman" w:eastAsia="Times New Roman" w:hAnsi="Times New Roman" w:cs="Times New Roman"/>
+          <w:kern w:val="0"/>
+          <w14:ligatures w14:val="none"/>
+        </w:rPr>
+      </w:pPr>
+      <w:r>
+        <w:rPr>
+          <w:rFonts w:ascii="Times New Roman" w:eastAsia="Times New Roman" w:hAnsi="Times New Roman" w:cs="Times New Roman"/>
+          <w:kern w:val="0"/>
+          <w14:ligatures w14:val="none"/>
+        </w:rPr>
+        <w:t>git push origin main</w:t>
+      </w:r>
+    </w:p>
+    <w:p>
+      <w:pPr>
+        <w:rPr>
+          <w:rFonts w:ascii="Times New Roman" w:eastAsia="Times New Roman" w:hAnsi="Times New Roman" w:cs="Times New Roman"/>
+          <w:kern w:val="0"/>
+          <w14:ligatures w14:val="none"/>
+        </w:rPr>
+      </w:pPr>
+      <w:r>
+        <w:rPr>
+          <w:rFonts w:ascii="Times New Roman" w:eastAsia="Times New Roman" w:hAnsi="Times New Roman" w:cs="Times New Roman"/>
+          <w:kern w:val="0"/>
+          <w14:ligatures w14:val="none"/>
+        </w:rPr>
+        <w:t>This sends your local commits up to GitHub. You might get a browser prompt to sign in — approve it.</w:t>
+      </w:r>
+    </w:p>
+    <w:p>
+      <w:pPr>
+        <w:rPr>
+          <w:rFonts w:ascii="Times New Roman" w:eastAsia="Times New Roman" w:hAnsi="Times New Roman" w:cs="Times New Roman"/>
+          <w:kern w:val="0"/>
+          <w14:ligatures w14:val="none"/>
+        </w:rPr>
+      </w:pPr>
+      <w:r>
+        <w:rPr>
+          <w:rFonts w:ascii="Times New Roman" w:eastAsia="Times New Roman" w:hAnsi="Times New Roman" w:cs="Times New Roman"/>
+          <w:b/>
+          <w:bCs/>
+          <w:kern w:val="0"/>
+          <w14:ligatures w14:val="none"/>
+        </w:rPr>
+        <w:t>To check what's about to be committed before you commit:</w:t>
+      </w:r>
+    </w:p>
+    <w:p>
+      <w:pPr>
+        <w:rPr>
+          <w:rFonts w:ascii="Times New Roman" w:eastAsia="Times New Roman" w:hAnsi="Times New Roman" w:cs="Times New Roman"/>
+          <w:kern w:val="0"/>
+          <w14:ligatures w14:val="none"/>
+        </w:rPr>
+      </w:pPr>
+      <w:r>
+        <w:rPr>
+          <w:rFonts w:ascii="Times New Roman" w:eastAsia="Times New Roman" w:hAnsi="Times New Roman" w:cs="Times New Roman"/>
+          <w:kern w:val="0"/>
+          <w14:ligatures w14:val="none"/>
+        </w:rPr>
+        <w:t>git status</w:t>
+      </w:r>
+    </w:p>
+    <w:p>
+      <w:pPr>
+        <w:rPr>
+          <w:rFonts w:ascii="Times New Roman" w:eastAsia="Times New Roman" w:hAnsi="Times New Roman" w:cs="Times New Roman"/>
+          <w:kern w:val="0"/>
+          <w14:ligatures w14:val="none"/>
+        </w:rPr>
+      </w:pPr>
+      <w:r>
+        <w:rPr>
+          <w:rFonts w:ascii="Times New Roman" w:eastAsia="Times New Roman" w:hAnsi="Times New Roman" w:cs="Times New Roman"/>
+          <w:kern w:val="0"/>
+          <w14:ligatures w14:val="none"/>
+        </w:rPr>
+        <w:t>Shows modified/new files in red (not staged) or green (staged).</w:t>
+      </w:r>
+    </w:p>
+    <w:p>
+      <w:pPr>
+        <w:rPr>
+          <w:rFonts w:ascii="Times New Roman" w:eastAsia="Times New Roman" w:hAnsi="Times New Roman" w:cs="Times New Roman"/>
+          <w:kern w:val="0"/>
+          <w14:ligatures w14:val="none"/>
+        </w:rPr>
+      </w:pPr>
+      <w:r>
+        <w:rPr>
+          <w:rFonts w:ascii="Times New Roman" w:eastAsia="Times New Roman" w:hAnsi="Times New Roman" w:cs="Times New Roman"/>
+          <w:b/>
+          <w:bCs/>
+          <w:kern w:val="0"/>
+          <w14:ligatures w14:val="none"/>
+        </w:rPr>
+        <w:t>Quick reference for future:</w:t>
+      </w:r>
+      <w:r>
+        <w:rPr>
+          <w:rFonts w:ascii="Times New Roman" w:eastAsia="Times New Roman" w:hAnsi="Times New Roman" w:cs="Times New Roman"/>
+          <w:kern w:val="0"/>
+          <w14:ligatures w14:val="none"/>
+        </w:rPr>
+        <w:t xml:space="preserve"> Every commit needs a message describing what </w:t>
+      </w:r>
+      <w:proofErr w:type="gramStart"/>
+      <w:r>
+        <w:rPr>
+          <w:rFonts w:ascii="Times New Roman" w:eastAsia="Times New Roman" w:hAnsi="Times New Roman" w:cs="Times New Roman"/>
+          <w:kern w:val="0"/>
+          <w14:ligatures w14:val="none"/>
+        </w:rPr>
+        <w:t>changed</w:t>
+      </w:r>
+      <w:proofErr w:type="gramEnd"/>
+      <w:r>
+        <w:rPr>
+          <w:rFonts w:ascii="Times New Roman" w:eastAsia="Times New Roman" w:hAnsi="Times New Roman" w:cs="Times New Roman"/>
+          <w:kern w:val="0"/>
+          <w14:ligatures w14:val="none"/>
+        </w:rPr>
+        <w:t xml:space="preserve">. Short and descriptive is </w:t>
+      </w:r>
+      <w:proofErr w:type="gramStart"/>
+      <w:r>
+        <w:rPr>
+          <w:rFonts w:ascii="Times New Roman" w:eastAsia="Times New Roman" w:hAnsi="Times New Roman" w:cs="Times New Roman"/>
+          <w:kern w:val="0"/>
+          <w14:ligatures w14:val="none"/>
+        </w:rPr>
+        <w:t>best — "</w:t>
+      </w:r>
+      <w:proofErr w:type="gramEnd"/>
+      <w:r>
+        <w:rPr>
+          <w:rFonts w:ascii="Times New Roman" w:eastAsia="Times New Roman" w:hAnsi="Times New Roman" w:cs="Times New Roman"/>
+          <w:kern w:val="0"/>
+          <w14:ligatures w14:val="none"/>
+        </w:rPr>
+        <w:t>Update homepage header" is better than "changes" or "update."</w:t>
+      </w:r>
+    </w:p>
+    <w:p>
+      <w:pPr>
+        <w:rPr>
+          <w:rFonts w:ascii="Times New Roman" w:eastAsia="Times New Roman" w:hAnsi="Times New Roman" w:cs="Times New Roman"/>
+          <w:kern w:val="0"/>
+          <w14:ligatures w14:val="none"/>
+        </w:rPr>
+      </w:pPr>
+      <w:r>
+        <w:rPr>
+          <w:rFonts w:ascii="Times New Roman" w:eastAsia="Times New Roman" w:hAnsi="Times New Roman" w:cs="Times New Roman"/>
+          <w:kern w:val="0"/>
+          <w14:ligatures w14:val="none"/>
+        </w:rPr>
+        <w:t>Let me know what happens when you run them.</w:t>
+      </w:r>
+    </w:p>
+    <w:p>
+      <w:pPr>
+        <w:rPr>
+          <w:rFonts w:ascii="Times New Roman" w:eastAsia="Times New Roman" w:hAnsi="Times New Roman" w:cs="Times New Roman"/>
+          <w:kern w:val="0"/>
+          <w14:ligatures w14:val="none"/>
+        </w:rPr>
+      </w:pPr>
     </w:p>
     <w:p/>
     <w:sectPr>
@@ -2176,7 +2603,6 @@
   <w:style w:type="character" w:default="1" w:styleId="DefaultParagraphFont">
     <w:name w:val="Default Paragraph Font"/>
     <w:uiPriority w:val="1"/>
-    <w:semiHidden/>
     <w:unhideWhenUsed/>
   </w:style>
   <w:style w:type="table" w:default="1" w:styleId="TableNormal">

</xml_diff>